<commit_message>
Expand Introduction into a proper literature review (Elsevier author-date style)
- Rewrite Section 1 into 1.1-1.5: forest/agroforestry microclimate offset paradigm
  (De Frenne, Zellweger, Lembrechts, Haesen, Maclean microclima, Kearney NicheMapR,
  Hardwick, Blaser cocoa, coffee microclimate-from-full-sun); crop-suitability ML;
  microclimate-driven disease & leaf-wetness models; conformal/transfer + digital twins;
  ending in an explicit research-gap statement and four objectives.
- Add refs 15-21 (microclima, NicheMapR, Blaser, coffee-AF, GIS-ML suitability, conformal
  crop DSS, global RF suitability); DOIs where confirmed, others flagged for final check.
- Remove remaining [verify] tags from the intro; regenerate manuscript.docx (lit review,
  3 tables, 7 figures embedded).
</commit_message>
<xml_diff>
--- a/docs/manuscript/submission/manuscript.docx
+++ b/docs/manuscript/submission/manuscript.docx
@@ -271,39 +271,29 @@
         <w:t>regional</w:t>
       </w:r>
       <w:r>
-        <w:t xml:space="preserve"> climate — gridded temperature, rainfall and humidity — and stop there. But a managed canopy is a microclimate engine: it buffers temperature extremes, raises humidity, cuts wind, and reshapes leaf-wetness duration, and those shifts — not the regional average — decide both crop performance and disease establishment (De Frenne et al., 2019; De Frenne et al., 2021 </w:t>
+        <w:t xml:space="preserve"> climate — gridded temperature, rainfall and humidity — and stop there. But a managed canopy is a microclimate engine: it buffers temperature extremes, raises humidity, cuts wind, and reshapes leaf-wetness duration, and those shifts — not the regional average — decide both crop performance and disease establishment (De Frenne et al., 2019; De Frenne et al., 2021). Two farms with identical regional climates can therefore support very different crops.</w:t>
+      </w:r>
+    </w:p>
+    <w:p>
+      <w:pPr>
+        <w:pStyle w:val="Heading2"/>
+      </w:pPr>
+      <w:r>
+        <w:t>1.1 Forest and agroforestry microclimate: the offset paradigm</w:t>
+      </w:r>
+    </w:p>
+    <w:p>
+      <w:r>
+        <w:t xml:space="preserve">A substantial body of forest-microclimate ecology has established that the </w:t>
       </w:r>
       <w:r>
         <w:rPr>
           <w:b/>
         </w:rPr>
-        <w:t>[verify]</w:t>
-      </w:r>
-      <w:r>
-        <w:t>). Two farms with identical regional climates can therefore support very different crops.</w:t>
-      </w:r>
-    </w:p>
-    <w:p>
-      <w:r>
-        <w:t xml:space="preserve">Three literatures bear on this problem but have not been joined. First, </w:t>
-      </w:r>
-      <w:r>
-        <w:rPr>
-          <w:b/>
-        </w:rPr>
-        <w:t>forest microclimate ecology</w:t>
-      </w:r>
-      <w:r>
-        <w:t xml:space="preserve"> has established that the </w:t>
-      </w:r>
-      <w:r>
-        <w:rPr>
-          <w:i/>
-        </w:rPr>
         <w:t>offset</w:t>
       </w:r>
       <w:r>
-        <w:t xml:space="preserve"> between sub-canopy and free-air temperature is a learnable, mappable function of canopy structure, topography and macroclimate: De Frenne et al. (2019) showed canopies buffer extremes across 98 sites on five continents with leaf area index a primary control, and Haesen et al. (2021) operationalised this as </w:t>
+        <w:t xml:space="preserve"> between sub-canopy and free-air conditions is a coherent, learnable function of canopy structure, topography and macroclimate. De Frenne et al. (2019) compared understory and open-site temperatures at 98 sites across five continents and showed that canopies act as thermal insulators — cooling hot extremes and warming cold ones, with leaf area index a primary control — and later reviewed the drivers and research agenda for forest microclimates (De Frenne et al., 2021). Zellweger et al. (2019) set out how remote sensing of canopy structure and thermal conditions advances microclimate mapping, and the community-curated SoilTemp database (Lembrechts et al., 2020) now aggregates more than 7,500 near-surface sensors worldwide. Building on these, Haesen et al. (2021) operationalised the paradigm as </w:t>
       </w:r>
       <w:r>
         <w:rPr>
@@ -312,25 +302,96 @@
         <w:t>ForestTemp</w:t>
       </w:r>
       <w:r>
-        <w:t xml:space="preserve">, a machine-learning model predicting the monthly sub-canopy temperature offset across Europe from ~1,200 in-situ series. Second, </w:t>
+        <w:t xml:space="preserve">, predicting the monthly sub-canopy temperature offset across Europe from ~1,200 in-situ series with boosted regression trees — the methodological precedent closest to the present work. In parallel, mechanistic microclimate models have matured: Maclean et al. (2019) released the </w:t>
+      </w:r>
+      <w:r>
+        <w:rPr>
+          <w:i/>
+        </w:rPr>
+        <w:t>microclima</w:t>
+      </w:r>
+      <w:r>
+        <w:t xml:space="preserve"> R package for meso- and microclimate, and Kearney and Porter (2017) the NicheMapR biophysical model, both deriving sub-canopy conditions from energy balance, terrain and vegetation.</w:t>
+      </w:r>
+    </w:p>
+    <w:p>
+      <w:r>
+        <w:t xml:space="preserve">The same buffering operates in managed canopies, which is what makes it agriculturally relevant. Hardwick et al. (2015) found tropical primary forest up to 6.5 °C cooler than adjacent oil-palm plantations, with leaf area index driving the difference. In agroforestry specifically, Blaser et al. (2018) showed that shade trees and pruning reshape throughfall and microclimate in cocoa systems; subsequent work found the buffering effect depends on shade-tree canopy height and species. Most directly analogous to our approach, coffee-agroforestry studies have estimated the under-canopy microclimate from full-sun weather data plus shade-tree characteristics — that is, they predict the agroforestry microclimate from the open-field climate and canopy structure, exactly the offset logic adopted here. What this literature does </w:t>
+      </w:r>
+      <w:r>
+        <w:rPr>
+          <w:i/>
+        </w:rPr>
+        <w:t>not</w:t>
+      </w:r>
+      <w:r>
+        <w:t xml:space="preserve"> do is treat the canopy as a set of </w:t>
       </w:r>
       <w:r>
         <w:rPr>
           <w:b/>
         </w:rPr>
-        <w:t>crop-suitability mapping</w:t>
-      </w:r>
-      <w:r>
-        <w:t xml:space="preserve"> matches crops to climate envelopes (e.g. FAO ECOCROP </w:t>
+        <w:t>design variables a farmer controls</w:t>
+      </w:r>
+      <w:r>
+        <w:t xml:space="preserve"> (species, spacing, pruning, windbreaks, drainage, fruiting time), nor chain the predicted microclimate to disease, crop viability and profit.</w:t>
+      </w:r>
+    </w:p>
+    <w:p>
+      <w:pPr>
+        <w:pStyle w:val="Heading2"/>
+      </w:pPr>
+      <w:r>
+        <w:t>1.2 Crop suitability modelling</w:t>
+      </w:r>
+    </w:p>
+    <w:p>
+      <w:r>
+        <w:t xml:space="preserve">Crop-suitability assessment has moved from FAO ECOCROP-style envelope matching to GIS multi-criteria and machine-learning approaches. GIS-MCDA frameworks (e.g. AgriSuit) and ML classifiers — Random Forest and gradient boosting prominently — now dominate, with recent studies reporting high suitability-classification accuracy for staple crops (e.g. wheat and pearl millet in arid India) and global Random-Forest suitability surfaces for 17 crops at ~1 km resolution; ML suitability has also been applied to agroforestry (e.g. olive–maize land-suitability classification). These approaches, however, operate at </w:t>
+      </w:r>
+      <w:r>
+        <w:rPr>
+          <w:i/>
+        </w:rPr>
+        <w:t>regional/landscape</w:t>
+      </w:r>
+      <w:r>
+        <w:t xml:space="preserve"> scale on macroclimate and soil and therefore cannot represent the within-farm microclimate a chosen canopy creates — the gap this work targets.</w:t>
+      </w:r>
+    </w:p>
+    <w:p>
+      <w:pPr>
+        <w:pStyle w:val="Heading2"/>
+      </w:pPr>
+      <w:r>
+        <w:t>1.3 Disease as a microclimate-driven layer</w:t>
+      </w:r>
+    </w:p>
+    <w:p>
+      <w:r>
+        <w:t xml:space="preserve">Plant pathology has long shown that foliar-disease establishment is governed by microclimate, especially </w:t>
       </w:r>
       <w:r>
         <w:rPr>
           <w:b/>
         </w:rPr>
-        <w:t>[verify]</w:t>
-      </w:r>
-      <w:r>
-        <w:t xml:space="preserve">) but at regional scale, ignoring within-farm canopy modification. Third, </w:t>
+        <w:t>leaf-wetness duration (LWD)</w:t>
+      </w:r>
+      <w:r>
+        <w:t xml:space="preserve"> and temperature. Operational disease-warning systems estimate LWD from weather and trigger management when infection conditions occur; empirical models using hours with relative humidity ≥ ~90% (or small dew-point depression) predict LWD about as well as machine-learning models and are deployed for many crops. A microclimate predictor can thus be chained to disease risk through established, data-light infection models — yet crop-suitability tools rarely close this loop, despite disease often being the true determinant of whether a climatically-suitable crop is profitable (e.g. humidity- and rain-driven bacterial blight in pomegranate).</w:t>
+      </w:r>
+    </w:p>
+    <w:p>
+      <w:pPr>
+        <w:pStyle w:val="Heading2"/>
+      </w:pPr>
+      <w:r>
+        <w:t>1.4 Uncertainty, transfer, and agricultural digital twins</w:t>
+      </w:r>
+    </w:p>
+    <w:p>
+      <w:r>
+        <w:t xml:space="preserve">As ecological and agricultural ML moves toward decision support, calibrated uncertainty and honest transfer have become central. Conformal prediction — and conformalised quantile regression in particular (Romano et al., 2019) — gives distribution-free, finite-sample prediction intervals around any model, and has been applied to crop-production decision support and earth-observation regression; group-conditional ("Mondrian") variants adapt coverage to subpopulations. Separately, </w:t>
       </w:r>
       <w:r>
         <w:rPr>
@@ -339,48 +400,65 @@
         <w:t>agricultural digital twins</w:t>
       </w:r>
       <w:r>
-        <w:t xml:space="preserve"> have been proposed as integrative decision tools, though reviews note most existing systems are monitoring/simulation platforms rather than mature, calibrated twins (Pylianidis et al., 2021 </w:t>
+        <w:t xml:space="preserve"> have been proposed as integrative decision platforms (Pylianidis et al., 2021), and agroforestry-specific decision-support systems are emerging — though reviews note most "twins" remain monitoring/simulation tools rather than calibrated, validated models, and few quantify </w:t>
+      </w:r>
+      <w:r>
+        <w:rPr>
+          <w:i/>
+        </w:rPr>
+        <w:t>when</w:t>
+      </w:r>
+      <w:r>
+        <w:t xml:space="preserve"> their predictions cease to transfer.</w:t>
+      </w:r>
+    </w:p>
+    <w:p>
+      <w:pPr>
+        <w:pStyle w:val="Heading2"/>
+      </w:pPr>
+      <w:r>
+        <w:t>1.5 Research gap and objectives</w:t>
+      </w:r>
+    </w:p>
+    <w:p>
+      <w:r>
+        <w:t xml:space="preserve">The individual pieces therefore exist — offset modelling, crop-suitability ML, microclimate-driven disease models, conformal uncertainty, and digital-twin framings — but they have </w:t>
       </w:r>
       <w:r>
         <w:rPr>
           <w:b/>
         </w:rPr>
-        <w:t>[verify]</w:t>
-      </w:r>
-      <w:r>
-        <w:t>).</w:t>
-      </w:r>
-    </w:p>
-    <w:p>
-      <w:r>
-        <w:t xml:space="preserve">The offset-modelling paradigm from forest ecology is precisely the right tool for the agroforestry-design question — but it has been applied to </w:t>
+        <w:t>not been joined into a single, design-driven, uncertainty-propagated decision chain</w:t>
+      </w:r>
+      <w:r>
+        <w:t xml:space="preserve">, and the </w:t>
+      </w:r>
+      <w:r>
+        <w:rPr>
+          <w:b/>
+        </w:rPr>
+        <w:t>transferability</w:t>
+      </w:r>
+      <w:r>
+        <w:t xml:space="preserve"> of a microclimate model trained in one region to a different macroclimate has rarely been tested or reported honestly. The present work addresses this gap. Its objectives are to: (i) build an end-to-end pipeline mapping </w:t>
       </w:r>
       <w:r>
         <w:rPr>
           <w:i/>
         </w:rPr>
-        <w:t>natural</w:t>
-      </w:r>
-      <w:r>
-        <w:t xml:space="preserve"> forests, where canopy structure is observed, not to </w:t>
-      </w:r>
-      <w:r>
-        <w:rPr>
-          <w:i/>
-        </w:rPr>
-        <w:t>managed</w:t>
-      </w:r>
-      <w:r>
-        <w:t xml:space="preserve"> agroforestry, where spacing, species, pruning, windbreaks and drainage are </w:t>
+        <w:t>controllable</w:t>
+      </w:r>
+      <w:r>
+        <w:t xml:space="preserve"> agroforestry design to microclimate, disease risk, crop viability and risk-adjusted profit, with an explicit confidence level on every layer; (ii) confine machine learning to the variables that need it (temperature and VPD offsets), with conformal intervals and an out-of-distribution flag, while using mechanistic physics for light and wind; (iii) test transfer rigorously — within-site and, critically, </w:t>
       </w:r>
       <w:r>
         <w:rPr>
           <w:b/>
         </w:rPr>
-        <w:t>design variables a farmer controls</w:t>
-      </w:r>
-      <w:r>
-        <w:t>. Nor has it been chained downstream to disease, economics and a profit decision. This work makes that combination its contribution:</w:t>
+        <w:t>across macroclimates</w:t>
+      </w:r>
+      <w:r>
+        <w:t xml:space="preserve"> — and report where it fails; and (iv) demonstrate the chain on a real smallholder site, propagating uncertainty to a planting decision. The integrating contribution is summarised as:</w:t>
       </w:r>
     </w:p>
     <w:p>
@@ -584,16 +662,7 @@
         <w:t>conformalised quantile regression</w:t>
       </w:r>
       <w:r>
-        <w:t xml:space="preserve"> (Romano et al., 2019 </w:t>
-      </w:r>
-      <w:r>
-        <w:rPr>
-          <w:b/>
-        </w:rPr>
-        <w:t>[verify]</w:t>
-      </w:r>
-      <w:r>
-        <w:t xml:space="preserve">) with a </w:t>
+        <w:t xml:space="preserve"> (Romano et al., 2019) with a </w:t>
       </w:r>
       <w:r>
         <w:rPr>
@@ -874,16 +943,7 @@
         <w:t>Microclimate labels (offsets).</w:t>
       </w:r>
       <w:r>
-        <w:t xml:space="preserve"> SAFE Project sub-canopy loggers, Sabah, Borneo (Zenodo 1228188) with plot coordinates from the SAFE Gazetteer (Zenodo 3906082); La Jarda, Cádiz, Spain, a Mediterranean forest network (Zenodo 18913503); and SAFE landscape microclimate rasters spanning forest → logged → oil-palm → cleared (Zenodo 7893600), which contribute the open-canopy regime (offsets up to +6.6 °C, matching Hardwick et al., 2015 </w:t>
-      </w:r>
-      <w:r>
-        <w:rPr>
-          <w:b/>
-        </w:rPr>
-        <w:t>[verify]</w:t>
-      </w:r>
-      <w:r>
-        <w:t xml:space="preserve">). The assembled dataset is </w:t>
+        <w:t xml:space="preserve"> SAFE Project sub-canopy loggers, Sabah, Borneo (Zenodo 1228188) with plot coordinates from the SAFE Gazetteer (Zenodo 3906082); La Jarda, Cádiz, Spain, a Mediterranean forest network (Zenodo 18913503); and SAFE landscape microclimate rasters spanning forest → logged → oil-palm → cleared (Zenodo 7893600), which contribute the open-canopy regime (offsets up to +6.6 °C, matching Hardwick et al., 2015). The assembled dataset is </w:t>
       </w:r>
       <w:r>
         <w:rPr>
@@ -2789,6 +2849,181 @@
     </w:p>
     <w:p>
       <w:pPr>
+        <w:pStyle w:val="ListNumber"/>
+      </w:pPr>
+      <w:r>
+        <w:t xml:space="preserve">Maclean, I. M. D., Mosedale, J. R., &amp; Bennie, J. J. (2019). Microclima: An R package for modelling meso- and microclimate. </w:t>
+      </w:r>
+      <w:r>
+        <w:rPr>
+          <w:i/>
+        </w:rPr>
+        <w:t>Methods in Ecology and Evolution</w:t>
+      </w:r>
+      <w:r>
+        <w:t>, 10(2), 280–290. https://doi.org/10.1111/2041-210X.13093</w:t>
+      </w:r>
+    </w:p>
+    <w:p>
+      <w:pPr>
+        <w:pStyle w:val="ListNumber"/>
+      </w:pPr>
+      <w:r>
+        <w:t xml:space="preserve">Kearney, M. R., &amp; Porter, W. P. (2017). NicheMapR — an R package for biophysical modelling: the microclimate model. </w:t>
+      </w:r>
+      <w:r>
+        <w:rPr>
+          <w:i/>
+        </w:rPr>
+        <w:t>Ecography</w:t>
+      </w:r>
+      <w:r>
+        <w:t>, 40(5), 664–674. https://doi.org/10.1111/ecog.02360</w:t>
+      </w:r>
+    </w:p>
+    <w:p>
+      <w:pPr>
+        <w:pStyle w:val="ListNumber"/>
+      </w:pPr>
+      <w:r>
+        <w:t>Blaser, W. J., Oppong, J., Yeboah, E., &amp; Six, J. (2018). Shade trees and tree pruning alter throughfall and microclimate in cocoa (</w:t>
+      </w:r>
+      <w:r>
+        <w:rPr>
+          <w:i/>
+        </w:rPr>
+        <w:t>Theobroma cacao</w:t>
+      </w:r>
+      <w:r>
+        <w:t xml:space="preserve"> L.) production systems. </w:t>
+      </w:r>
+      <w:r>
+        <w:rPr>
+          <w:i/>
+        </w:rPr>
+        <w:t>Annals of Forest Science</w:t>
+      </w:r>
+      <w:r>
+        <w:t xml:space="preserve"> / </w:t>
+      </w:r>
+      <w:r>
+        <w:rPr>
+          <w:i/>
+        </w:rPr>
+        <w:t>Agriculture, Ecosystems &amp; Environment</w:t>
+      </w:r>
+      <w:r>
+        <w:t xml:space="preserve">. </w:t>
+      </w:r>
+      <w:r>
+        <w:rPr>
+          <w:i/>
+        </w:rPr>
+        <w:t>(DOI to confirm: 10.1007/s13595-018-0723-9)</w:t>
+      </w:r>
+    </w:p>
+    <w:p>
+      <w:pPr>
+        <w:pStyle w:val="ListNumber"/>
+      </w:pPr>
+      <w:r>
+        <w:t xml:space="preserve">Coffee-agroforestry microclimate estimation from full-sun weather data and shade-tree characteristics. </w:t>
+      </w:r>
+      <w:r>
+        <w:rPr>
+          <w:i/>
+        </w:rPr>
+        <w:t>European Journal of Agronomy</w:t>
+      </w:r>
+      <w:r>
+        <w:t xml:space="preserve"> (2021). </w:t>
+      </w:r>
+      <w:r>
+        <w:rPr>
+          <w:i/>
+        </w:rPr>
+        <w:t>(full author list + DOI to confirm; ScienceDirect S1161030121001672)</w:t>
+      </w:r>
+    </w:p>
+    <w:p>
+      <w:pPr>
+        <w:pStyle w:val="ListNumber"/>
+      </w:pPr>
+      <w:r>
+        <w:t xml:space="preserve">Möller, M., et al. — </w:t>
+      </w:r>
+      <w:r>
+        <w:rPr>
+          <w:i/>
+        </w:rPr>
+        <w:t>GIS-based cropland suitability prediction using machine learning. Agronomy</w:t>
+      </w:r>
+      <w:r>
+        <w:t xml:space="preserve">, 12(9), 2210 (2022). https://doi.org/10.3390/agronomy12092210 </w:t>
+      </w:r>
+      <w:r>
+        <w:rPr>
+          <w:i/>
+        </w:rPr>
+        <w:t>(confirm author list)</w:t>
+      </w:r>
+    </w:p>
+    <w:p>
+      <w:pPr>
+        <w:pStyle w:val="ListNumber"/>
+      </w:pPr>
+      <w:r>
+        <w:t xml:space="preserve">Conformal prediction for uncertainty quantification in crop-production decision support. </w:t>
+      </w:r>
+      <w:r>
+        <w:rPr>
+          <w:i/>
+        </w:rPr>
+        <w:t>Computers and Electronics in Agriculture</w:t>
+      </w:r>
+      <w:r>
+        <w:t xml:space="preserve"> (2025). </w:t>
+      </w:r>
+      <w:r>
+        <w:rPr>
+          <w:i/>
+        </w:rPr>
+        <w:t>(full author list + DOI to confirm; ScienceDirect S0168169925006659)</w:t>
+      </w:r>
+    </w:p>
+    <w:p>
+      <w:pPr>
+        <w:pStyle w:val="ListNumber"/>
+      </w:pPr>
+      <w:r>
+        <w:t xml:space="preserve">Global Random-Forest crop-suitability surfaces for 17 crops under present and future climate. </w:t>
+      </w:r>
+      <w:r>
+        <w:rPr>
+          <w:i/>
+        </w:rPr>
+        <w:t>Scientific Data</w:t>
+      </w:r>
+      <w:r>
+        <w:t xml:space="preserve"> (2024/2026). </w:t>
+      </w:r>
+      <w:r>
+        <w:rPr>
+          <w:i/>
+        </w:rPr>
+        <w:t>(full author list + DOI to confirm)</w:t>
+      </w:r>
+    </w:p>
+    <w:p>
+      <w:r>
+        <w:rPr>
+          <w:i/>
+        </w:rPr>
+        <w:t>Refs 15–16, 19 carry confirmed DOIs; refs 17–18, 20–21 are real, located sources whose full author lists / DOIs should be finalised from the publisher record before submission (same discipline as the dataset citations). All §1 author–date citations resolve to entries in this list; final formatting to the target journal's author–date alphabetical style is a copy-edit step.</w:t>
+      </w:r>
+    </w:p>
+    <w:p>
+      <w:pPr>
         <w:pStyle w:val="Heading1"/>
       </w:pPr>
       <w:r>

</xml_diff>

<commit_message>
Add 5 mechanistic equations (windbreak, disease beta-response, LWD, waterlogging index, bearing-ramp); renumber to 22
- New numbered equations from actual code: windbreak porosity penalty (Eq 3),
  disease temperature beta-response (6), leaf-wetness-duration proxy (7),
  waterlogging index (9), bearing-ramp maintenance (13).
- Renumber all equations sequentially 1-22; fix in-text refs (Eq 20 skill;
  Eqs 21-22 conformal; Eqs 11-17 economics). Regenerate manuscript.docx.
</commit_message>
<xml_diff>
--- a/docs/manuscript/submission/manuscript.docx
+++ b/docs/manuscript/submission/manuscript.docx
@@ -2155,7 +2155,24 @@
     </w:p>
     <w:p>
       <w:r>
-        <w:t>with an extinction coefficient k_ext per overstorey. In-field wind reduction combines canopy drag with a perimeter-windbreak term that peaks at ~45 % porosity (a Gaussian in porosity, so a solid wall cannot "win") and saturates with barrier height — standard shelterbelt aerodynamics. These need no training data.</w:t>
+        <w:t>with an extinction coefficient k_ext per overstorey. In-field wind reduction combines canopy drag with a perimeter-windbreak term whose average shelter is a Gaussian in porosity φ, peaking near 45 % (so a solid wall cannot "win") and gated by barrier height h:</w:t>
+      </w:r>
+    </w:p>
+    <w:p>
+      <w:r>
+        <w:rPr>
+          <w:rFonts w:ascii="Consolas" w:hAnsi="Consolas"/>
+          <w:sz w:val="19"/>
+        </w:rPr>
+        <w:t>r_wb = 0.5 · exp[ −((φ − 0.45)/0.18)² ] · min(1, h/10)</w:t>
+      </w:r>
+      <w:r>
+        <w:t xml:space="preserve">   (3)</w:t>
+      </w:r>
+    </w:p>
+    <w:p>
+      <w:r>
+        <w:t>— standard shelterbelt aerodynamics. These need no training data.</w:t>
       </w:r>
     </w:p>
     <w:p>
@@ -2215,7 +2232,7 @@
         <w:t>OOD(x) = (1/p) Σⱼ 1[ xⱼ &lt; min_train,ⱼ  or  xⱼ &gt; max_train,ⱼ ]</w:t>
       </w:r>
       <w:r>
-        <w:t xml:space="preserve">   (3)</w:t>
+        <w:t xml:space="preserve">   (4)</w:t>
       </w:r>
     </w:p>
     <w:p>
@@ -2274,7 +2291,7 @@
         <w:t>realized_risk = environmental_pressure(microclimate) × variety_susceptibility</w:t>
       </w:r>
       <w:r>
-        <w:t xml:space="preserve">   (4)</w:t>
+        <w:t xml:space="preserve">   (5)</w:t>
       </w:r>
     </w:p>
     <w:p>
@@ -2288,7 +2305,7 @@
         <w:t>two independent axes</w:t>
       </w:r>
       <w:r>
-        <w:t xml:space="preserve">: a </w:t>
+        <w:t xml:space="preserve">. On the </w:t>
       </w:r>
       <w:r>
         <w:rPr>
@@ -2297,7 +2314,41 @@
         <w:t>foliar / air-microclimate</w:t>
       </w:r>
       <w:r>
-        <w:t xml:space="preserve"> axis (a temperature beta-response × leaf-wetness-duration or relative-humidity term, with a rain-splash modifier) and a </w:t>
+        <w:t xml:space="preserve"> axis the temperature response is a beta function with cardinal temperatures (T_min, T_opt, T_max),</w:t>
+      </w:r>
+    </w:p>
+    <w:p>
+      <w:r>
+        <w:rPr>
+          <w:rFonts w:ascii="Consolas" w:hAnsi="Consolas"/>
+          <w:sz w:val="19"/>
+        </w:rPr>
+        <w:t>g(T) = [(T_max − T)/(T_max − T_opt)] · [(T − T_min)/(T_opt − T_min)]^{(T_opt − T_min)/(T_max − T_opt)}</w:t>
+      </w:r>
+      <w:r>
+        <w:t xml:space="preserve">   (6)</w:t>
+      </w:r>
+    </w:p>
+    <w:p>
+      <w:r>
+        <w:t>(zero outside [T_min, T_max]), modulated by a leaf-wetness-duration proxy estimated from daily RH and rainfall,</w:t>
+      </w:r>
+    </w:p>
+    <w:p>
+      <w:r>
+        <w:rPr>
+          <w:rFonts w:ascii="Consolas" w:hAnsi="Consolas"/>
+          <w:sz w:val="19"/>
+        </w:rPr>
+        <w:t>LWD = min{ 24,  12·max(0, (RH − 80)/20) + 1[rain&gt;0]·min(8, 4 + 0.2·rain) }</w:t>
+      </w:r>
+      <w:r>
+        <w:t xml:space="preserve">  (h)   (7)</w:t>
+      </w:r>
+    </w:p>
+    <w:p>
+      <w:r>
+        <w:t xml:space="preserve">The </w:t>
       </w:r>
       <w:r>
         <w:rPr>
@@ -2306,7 +2357,7 @@
         <w:t>soil-water</w:t>
       </w:r>
       <w:r>
-        <w:t xml:space="preserve"> axis for soil-borne pathogens, driven by</w:t>
+        <w:t xml:space="preserve"> axis for soil-borne pathogens is driven by effective waterlogging instead of air RH,</w:t>
       </w:r>
     </w:p>
     <w:p>
@@ -2318,21 +2369,29 @@
         <w:t>effective_waterlogging = site_waterlogging × drainage_mitigation</w:t>
       </w:r>
       <w:r>
-        <w:t xml:space="preserve">   (5)</w:t>
+        <w:t xml:space="preserve">   (8)</w:t>
       </w:r>
     </w:p>
     <w:p>
       <w:r>
-        <w:t xml:space="preserve">(explicitly </w:t>
-      </w:r>
+        <w:t>with the site term estimated from soil texture and depth-to-water-table d_wt,</w:t>
+      </w:r>
+    </w:p>
+    <w:p>
       <w:r>
         <w:rPr>
-          <w:i/>
+          <w:rFonts w:ascii="Consolas" w:hAnsi="Consolas"/>
+          <w:sz w:val="19"/>
         </w:rPr>
-        <w:t>not</w:t>
-      </w:r>
-      <w:r>
-        <w:t xml:space="preserve"> air RH). Leaf-wetness duration is estimated from daily RH and rainfall (a deliberately crude, LOW-confidence first approximation). Variety susceptibility enters as an ordinal multiplier (R/MR/MS/S → 0.2/0.5/0.8/1.0) from published cultivar screening. The two controllable levers are explicit: fruiting-time (bahar) suppresses the foliar axis by avoiding the wet window; drainage suppresses the soil axis.</w:t>
+        <w:t>WLI = 0.5·min(1, clay/50) + 0.5·max(0, 1 − d_wt/3)</w:t>
+      </w:r>
+      <w:r>
+        <w:t xml:space="preserve">   (9)</w:t>
+      </w:r>
+    </w:p>
+    <w:p>
+      <w:r>
+        <w:t>(clay in %, d_wt in m). Variety susceptibility enters as an ordinal multiplier (R/MR/MS/S → 0.2/0.5/0.8/1.0) from published cultivar screening. The two controllable levers are explicit: fruiting-time (bahar) suppresses the foliar axis by avoiding the wet window; drainage suppresses the soil axis.</w:t>
       </w:r>
     </w:p>
     <w:p>
@@ -2366,7 +2425,7 @@
         <w:t>viability = growth_fit × (1 − disease_risk)</w:t>
       </w:r>
       <w:r>
-        <w:t xml:space="preserve">   (6)</w:t>
+        <w:t xml:space="preserve">   (10)</w:t>
       </w:r>
     </w:p>
     <w:p>
@@ -2405,7 +2464,7 @@
         <w:t>attainable_yield = reference_yield × growth_fit × (1 − disease_risk)</w:t>
       </w:r>
       <w:r>
-        <w:t xml:space="preserve">   (7)</w:t>
+        <w:t xml:space="preserve">   (11)</w:t>
       </w:r>
     </w:p>
     <w:p>
@@ -2417,12 +2476,39 @@
         <w:t>crop_margin = attainable_yield × price − cost</w:t>
       </w:r>
       <w:r>
-        <w:t xml:space="preserve">   (8)</w:t>
+        <w:t xml:space="preserve">   (12)</w:t>
       </w:r>
     </w:p>
     <w:p>
       <w:r>
-        <w:t>with banded mandi prices and costs validated against NHB DPRs and TNAU. Overstorey income is modelled for coconut (annual nuts) and timber (annualised over rotation). A 25-year discounted cash-flow respects timing (gestation, bearing ramp, single-harvest timber):</w:t>
+        <w:t>with banded mandi prices and costs validated against NHB DPRs and TNAU. Maintenance scales with a bearing ramp so juvenile years cost only a fraction f_juv = 0.3 of full upkeep,</w:t>
+      </w:r>
+    </w:p>
+    <w:p>
+      <w:r>
+        <w:rPr>
+          <w:rFonts w:ascii="Consolas" w:hAnsi="Consolas"/>
+          <w:sz w:val="19"/>
+        </w:rPr>
+        <w:t>ramp(t) = 0  (t &lt; gestation or t &gt; life);  1  (t ≥ full);  (t − gestation + 1)/(full − gestation + 1)  otherwise</w:t>
+      </w:r>
+      <w:r>
+        <w:t xml:space="preserve">,   </w:t>
+      </w:r>
+      <w:r>
+        <w:rPr>
+          <w:rFonts w:ascii="Consolas" w:hAnsi="Consolas"/>
+          <w:sz w:val="19"/>
+        </w:rPr>
+        <w:t>maint(t) = maintain · max(f_juv, ramp(t))</w:t>
+      </w:r>
+      <w:r>
+        <w:t xml:space="preserve">   (13)</w:t>
+      </w:r>
+    </w:p>
+    <w:p>
+      <w:r>
+        <w:t>(charging full maintenance during gestation was a bug we caught by reality-checking against measured coconut economics — a validation-discipline illustration, §3.5). Overstorey income is modelled for coconut (annual nuts) and timber (annualised over rotation). A 25-year discounted cash-flow respects timing (gestation, bearing ramp, single-harvest timber):</w:t>
       </w:r>
     </w:p>
     <w:p>
@@ -2444,12 +2530,12 @@
         <w:t>0 = Σ_{t=1}^{H} C_t / (1 + IRR)^t</w:t>
       </w:r>
       <w:r>
-        <w:t xml:space="preserve">   (9, 10)</w:t>
+        <w:t xml:space="preserve">   (14, 15)</w:t>
       </w:r>
     </w:p>
     <w:p>
       <w:r>
-        <w:t>with r = 0.08 real and H = 25 yr. Maintenance scales with the bearing ramp (juvenile years cost a fraction of full upkeep); charging full maintenance during gestation was a bug we caught by reality-checking against measured coconut economics and report as a validation-discipline illustration (§3.5).</w:t>
+        <w:t>with r = 0.08 real and H = 25 yr.</w:t>
       </w:r>
     </w:p>
     <w:p>
@@ -2474,7 +2560,7 @@
         <w:t>NPV⁽ᵐ⁾ = f(offset⁽ᵐ⁾, yield⁽ᵐ⁾, price⁽ᵐ⁾, overstorey⁽ᵐ⁾)</w:t>
       </w:r>
       <w:r>
-        <w:t xml:space="preserve">   (11)</w:t>
+        <w:t xml:space="preserve">   (16)</w:t>
       </w:r>
     </w:p>
     <w:p>
@@ -2486,7 +2572,7 @@
         <w:t>P(loss) = (1/M) Σ_{m=1}^{M} 1[ NPV⁽ᵐ⁾ &lt; 0 ]</w:t>
       </w:r>
       <w:r>
-        <w:t xml:space="preserve">   (12)</w:t>
+        <w:t xml:space="preserve">   (17)</w:t>
       </w:r>
     </w:p>
     <w:p>
@@ -2503,7 +2589,7 @@
         <w:t>objective = 0.7 · E[system_margin] + 0.3 · system_margin_downside</w:t>
       </w:r>
       <w:r>
-        <w:t xml:space="preserve">   (13)</w:t>
+        <w:t xml:space="preserve">   (18)</w:t>
       </w:r>
     </w:p>
     <w:p>
@@ -2543,7 +2629,7 @@
         <w:t>skill = 1 − MAE_model / MAE_baseline</w:t>
       </w:r>
       <w:r>
-        <w:t xml:space="preserve">   (14, 15)</w:t>
+        <w:t xml:space="preserve">   (19, 20)</w:t>
       </w:r>
     </w:p>
     <w:p>
@@ -2588,7 +2674,7 @@
         <w:t>q̂_α = Quantile_{0.80}({sᵢ})</w:t>
       </w:r>
       <w:r>
-        <w:t xml:space="preserve">   (16, 17)</w:t>
+        <w:t xml:space="preserve">   (21, 22)</w:t>
       </w:r>
     </w:p>
     <w:p>
@@ -2671,7 +2757,7 @@
         <w:t>Table 3.</w:t>
       </w:r>
       <w:r>
-        <w:t xml:space="preserve"> Full leave-one-site-out (596 sites). Skill is defined in Eq. (15).</w:t>
+        <w:t xml:space="preserve"> Full leave-one-site-out (596 sites). Skill is defined in Eq. (20).</w:t>
       </w:r>
     </w:p>
     <w:tbl>
@@ -3343,7 +3429,7 @@
     </w:p>
     <w:p>
       <w:r>
-        <w:t xml:space="preserve">The out-of-climate coverage collapse is recoverable, and cheaply (Table 5; Fig. 6). Recalibrating the conformal width (Eqs. 16–17) on n_cal points drawn from the held-out climate, averaged over five seeds: at n_cal = 0 (the LOCO collapse) dT_mean coverage on the held-out Mediterranean climate is 0.08; with just </w:t>
+        <w:t xml:space="preserve">The out-of-climate coverage collapse is recoverable, and cheaply (Table 5; Fig. 6). Recalibrating the conformal width (Eqs. 21–22) on n_cal points drawn from the held-out climate, averaged over five seeds: at n_cal = 0 (the LOCO collapse) dT_mean coverage on the held-out Mediterranean climate is 0.08; with just </w:t>
       </w:r>
       <w:r>
         <w:rPr>
@@ -4045,7 +4131,7 @@
     </w:p>
     <w:p>
       <w:r>
-        <w:t xml:space="preserve">Converting viability to profit (Eqs. 7–12) turns "can the crop grow?" into "is the system worth planting under uncertainty?" (Table 7; Figs. 9–11). Over 25 years at an 8 % real hurdle, coconut + </w:t>
+        <w:t xml:space="preserve">Converting viability to profit (Eqs. 11–17) turns "can the crop grow?" into "is the system worth planting under uncertainty?" (Table 7; Figs. 9–11). Over 25 years at an 8 % real hurdle, coconut + </w:t>
       </w:r>
       <w:r>
         <w:rPr>

</xml_diff>

<commit_message>
Add model-family benchmark under climate shift (Ridge/RF/GP/MoE vs XGBoost/hybrid)
- scripts/benchmark_models.py -> reports/benchmark_metrics.json: 6 families, same
  offset task/folds, skill + coverage under grouped site holdout and LOCO.
- Finding: in-distribution all skilful; under LOCO, linear + mixture-of-experts collapse,
  tree models bounded but lose skill, only the distance-aware Gaussian process keeps
  non-negative cross-climate skill and best out-of-climate coverage. Transfer failure is
  a data-regime property, not an estimator flaw.
- Manuscript: new Methods 2.10 + Results 3.4 (Table 8) + Fig 12; few-shot reframed as
  few-shot domain adaptation; Discussion/Conclusion/Highlights updated; Anaikadu->3.5,
  economics->3.6 with cross-refs fixed. docx regenerated (9 tables, 12 figures). 26 tests pass.
</commit_message>
<xml_diff>
--- a/docs/manuscript/submission/manuscript.docx
+++ b/docs/manuscript/submission/manuscript.docx
@@ -96,6 +96,14 @@
       </w:pPr>
       <w:r>
         <w:t>~5–25 local calibration points restore out-of-climate interval coverage from 0.08 to ~0.80 — quantifying the value of on-plot sensing.</w:t>
+      </w:r>
+    </w:p>
+    <w:p>
+      <w:pPr>
+        <w:pStyle w:val="ListBullet"/>
+      </w:pPr>
+      <w:r>
+        <w:t>A six-family benchmark shows transfer failure is a data-regime property, not an estimator flaw; only a distance-aware Gaussian process stays calibrated out-of-climate.</w:t>
       </w:r>
     </w:p>
     <w:p>
@@ -2508,7 +2516,7 @@
     </w:p>
     <w:p>
       <w:r>
-        <w:t>(charging full maintenance during gestation was a bug we caught by reality-checking against measured coconut economics — a validation-discipline illustration, §3.5). Overstorey income is modelled for coconut (annual nuts) and timber (annualised over rotation). A 25-year discounted cash-flow respects timing (gestation, bearing ramp, single-harvest timber):</w:t>
+        <w:t>(charging full maintenance during gestation was a bug we caught by reality-checking against measured coconut economics — a validation-discipline illustration, §3.6). Overstorey income is modelled for coconut (annual nuts) and timber (annualised over rotation). A 25-year discounted cash-flow respects timing (gestation, bearing ramp, single-harvest timber):</w:t>
       </w:r>
     </w:p>
     <w:p>
@@ -2690,6 +2698,37 @@
       </w:r>
       <w:r>
         <w:t>.</w:t>
+      </w:r>
+    </w:p>
+    <w:p>
+      <w:pPr>
+        <w:pStyle w:val="Heading2"/>
+      </w:pPr>
+      <w:r>
+        <w:t>2.10 Model-family comparison</w:t>
+      </w:r>
+    </w:p>
+    <w:p>
+      <w:r>
+        <w:t xml:space="preserve">To probe whether transfer failure is estimator-specific, we evaluate six model families on the same features, targets and folds (§3.4): Ridge regression, Random Forest, a </w:t>
+      </w:r>
+      <w:r>
+        <w:rPr>
+          <w:b/>
+        </w:rPr>
+        <w:t>Gaussian process</w:t>
+      </w:r>
+      <w:r>
+        <w:t xml:space="preserve"> (RBF + white-noise kernel on standardised features, giving a distance-aware predictive variance), a non-neural </w:t>
+      </w:r>
+      <w:r>
+        <w:rPr>
+          <w:b/>
+        </w:rPr>
+        <w:t>mixture-of-experts</w:t>
+      </w:r>
+      <w:r>
+        <w:t xml:space="preserve"> (one Ridge expert per training regime with a softmax distance gate, uncertainty from expert disagreement), the XGBoost-quantile model of §2.4, and the physics-prior hybrid. All are wrapped to a common interval interface and scored by skill (Eq. 20) and interval coverage under both a grouped site holdout and leave-one-climate-out. Neural variants (domain-adversarial representation learning, neural residual networks) are deliberately out of scope here — a three-regime dataset overfits them, and domain-invariant representations risk erasing genuinely regime-dependent buffering — and are noted as future work.</w:t>
       </w:r>
     </w:p>
     <w:p>
@@ -3456,7 +3495,16 @@
         <w:t>uncertainty</w:t>
       </w:r>
       <w:r>
-        <w:t xml:space="preserve"> — the quantity that makes the tool honest — is restored by on the order of ten local measurements. It also shows the failure in §3.2 is one of calibration transfer, not a broken model.</w:t>
+        <w:t xml:space="preserve"> — the quantity that makes the tool honest — is restored by on the order of ten local measurements. It also shows the failure in §3.2 is one of calibration transfer, not a broken model. Framed in transfer-learning terms, this is a non-parametric </w:t>
+      </w:r>
+      <w:r>
+        <w:rPr>
+          <w:b/>
+        </w:rPr>
+        <w:t>few-shot domain adaptation</w:t>
+      </w:r>
+      <w:r>
+        <w:t xml:space="preserve"> of the uncertainty model; full point-prediction adaptation (meta-learning, neural processes) would require many more regimes to train and is left for future work.</w:t>
       </w:r>
     </w:p>
     <w:p>
@@ -3806,7 +3854,459 @@
         <w:pStyle w:val="Heading2"/>
       </w:pPr>
       <w:r>
-        <w:t>3.4 Anaikadu case study: microclimate and crop ranking</w:t>
+        <w:t>3.4 Model-family comparison under climate shift</w:t>
+      </w:r>
+    </w:p>
+    <w:p>
+      <w:r>
+        <w:t xml:space="preserve">To test whether the transfer failure is specific to gradient boosting or a property of the problem, we benchmarked six model families on the identical offset task and folds (Methods §2.10; Table 8; Fig. 12): a Ridge linear baseline, Random Forest, a Gaussian process (distance-aware predictive variance), a non-neural mixture-of-experts (one regime expert + a distance gate), the paper's XGBoost-quantile model, and the physics-prior hybrid. Two results stand out. First, </w:t>
+      </w:r>
+      <w:r>
+        <w:rPr>
+          <w:b/>
+        </w:rPr>
+        <w:t>in-distribution every family is skilful</w:t>
+      </w:r>
+      <w:r>
+        <w:t xml:space="preserve"> (positive skill on a grouped site holdout), so the within-climate signal is real and estimator-agnostic. Second, </w:t>
+      </w:r>
+      <w:r>
+        <w:rPr>
+          <w:b/>
+        </w:rPr>
+        <w:t>under leave-one-climate-out the families diverge sharply</w:t>
+      </w:r>
+      <w:r>
+        <w:t xml:space="preserve">: the linear model and the mixture-of-experts extrapolate catastrophically (skill ≈ −324 % and −82 % averaged over targets), the tree-based models (XGBoost, Random Forest, hybrid) are bounded but lose essentially all skill (≈ −7 to −19 %), and </w:t>
+      </w:r>
+      <w:r>
+        <w:rPr>
+          <w:b/>
+        </w:rPr>
+        <w:t>only the Gaussian process retains non-negative cross-climate skill (≈ +7 %) while keeping the best-calibrated out-of-climate intervals</w:t>
+      </w:r>
+      <w:r>
+        <w:t xml:space="preserve"> (coverage ≈ 0.62 vs 0.31–0.58), because its variance grows with distance from the training data. The mixture-of-experts attains comparable coverage only by inflating intervals through expert disagreement, not by predicting better. No family transfers across the warm-night gap — confirming the limitation is the data regime, not the estimator — but the comparison shows that </w:t>
+      </w:r>
+      <w:r>
+        <w:rPr>
+          <w:b/>
+        </w:rPr>
+        <w:t>distance-aware uncertainty</w:t>
+      </w:r>
+      <w:r>
+        <w:t xml:space="preserve"> (the Gaussian process, and by extension the conformal layer used throughout) is the most honest estimator under climate shift, and motivates the few-shot recalibration of §3.3.</w:t>
+      </w:r>
+    </w:p>
+    <w:p>
+      <w:r>
+        <w:rPr>
+          <w:b/>
+        </w:rPr>
+        <w:t>Table 8.</w:t>
+      </w:r>
+      <w:r>
+        <w:t xml:space="preserve"> Model-family comparison: skill (vs train-mean baseline, Eq. 20) and out-of-climate interval coverage, averaged over the three offset targets. </w:t>
+      </w:r>
+      <w:r>
+        <w:rPr>
+          <w:i/>
+        </w:rPr>
+        <w:t>In-distribution</w:t>
+      </w:r>
+      <w:r>
+        <w:t xml:space="preserve"> is a grouped 20 % site holdout (single split, for relative comparison between models; the robust within-climate figure is the full LOSO of Table 3). </w:t>
+      </w:r>
+      <w:r>
+        <w:rPr>
+          <w:i/>
+        </w:rPr>
+        <w:t>LOCO</w:t>
+      </w:r>
+      <w:r>
+        <w:t xml:space="preserve"> is leave-one-climate-out.</w:t>
+      </w:r>
+    </w:p>
+    <w:tbl>
+      <w:tblPr>
+        <w:tblStyle w:val="LightGrid-Accent1"/>
+        <w:tblW w:type="auto" w:w="0"/>
+        <w:jc w:val="center"/>
+        <w:tblLook w:firstColumn="1" w:firstRow="1" w:lastColumn="0" w:lastRow="0" w:noHBand="0" w:noVBand="1" w:val="04A0"/>
+      </w:tblPr>
+      <w:tblGrid>
+        <w:gridCol w:w="2160"/>
+        <w:gridCol w:w="2160"/>
+        <w:gridCol w:w="2160"/>
+        <w:gridCol w:w="2160"/>
+      </w:tblGrid>
+      <w:tr>
+        <w:tc>
+          <w:tcPr>
+            <w:tcW w:type="dxa" w:w="2160"/>
+          </w:tcPr>
+          <w:p>
+            <w:r>
+              <w:rPr>
+                <w:b/>
+              </w:rPr>
+            </w:r>
+            <w:r>
+              <w:rPr>
+                <w:b/>
+              </w:rPr>
+              <w:t>Model</w:t>
+            </w:r>
+          </w:p>
+        </w:tc>
+        <w:tc>
+          <w:tcPr>
+            <w:tcW w:type="dxa" w:w="2160"/>
+          </w:tcPr>
+          <w:p>
+            <w:r>
+              <w:rPr>
+                <w:b/>
+              </w:rPr>
+            </w:r>
+            <w:r>
+              <w:rPr>
+                <w:b/>
+              </w:rPr>
+              <w:t>In-distribution skill</w:t>
+            </w:r>
+          </w:p>
+        </w:tc>
+        <w:tc>
+          <w:tcPr>
+            <w:tcW w:type="dxa" w:w="2160"/>
+          </w:tcPr>
+          <w:p>
+            <w:r>
+              <w:rPr>
+                <w:b/>
+              </w:rPr>
+            </w:r>
+            <w:r>
+              <w:rPr>
+                <w:b/>
+              </w:rPr>
+              <w:t>Cross-climate (LOCO) skill</w:t>
+            </w:r>
+          </w:p>
+        </w:tc>
+        <w:tc>
+          <w:tcPr>
+            <w:tcW w:type="dxa" w:w="2160"/>
+          </w:tcPr>
+          <w:p>
+            <w:r>
+              <w:rPr>
+                <w:b/>
+              </w:rPr>
+            </w:r>
+            <w:r>
+              <w:rPr>
+                <w:b/>
+              </w:rPr>
+              <w:t>LOCO coverage</w:t>
+            </w:r>
+          </w:p>
+        </w:tc>
+      </w:tr>
+      <w:tr>
+        <w:tc>
+          <w:tcPr>
+            <w:tcW w:type="dxa" w:w="2160"/>
+          </w:tcPr>
+          <w:p>
+            <w:r/>
+            <w:r>
+              <w:t>Ridge (linear)</w:t>
+            </w:r>
+          </w:p>
+        </w:tc>
+        <w:tc>
+          <w:tcPr>
+            <w:tcW w:type="dxa" w:w="2160"/>
+          </w:tcPr>
+          <w:p>
+            <w:r/>
+            <w:r>
+              <w:t>+34 %</w:t>
+            </w:r>
+          </w:p>
+        </w:tc>
+        <w:tc>
+          <w:tcPr>
+            <w:tcW w:type="dxa" w:w="2160"/>
+          </w:tcPr>
+          <w:p>
+            <w:r/>
+            <w:r>
+              <w:t>−324 %</w:t>
+            </w:r>
+          </w:p>
+        </w:tc>
+        <w:tc>
+          <w:tcPr>
+            <w:tcW w:type="dxa" w:w="2160"/>
+          </w:tcPr>
+          <w:p>
+            <w:r/>
+            <w:r>
+              <w:t>0.31</w:t>
+            </w:r>
+          </w:p>
+        </w:tc>
+      </w:tr>
+      <w:tr>
+        <w:tc>
+          <w:tcPr>
+            <w:tcW w:type="dxa" w:w="2160"/>
+          </w:tcPr>
+          <w:p>
+            <w:r/>
+            <w:r>
+              <w:t>Random forest</w:t>
+            </w:r>
+          </w:p>
+        </w:tc>
+        <w:tc>
+          <w:tcPr>
+            <w:tcW w:type="dxa" w:w="2160"/>
+          </w:tcPr>
+          <w:p>
+            <w:r/>
+            <w:r>
+              <w:t>+42 %</w:t>
+            </w:r>
+          </w:p>
+        </w:tc>
+        <w:tc>
+          <w:tcPr>
+            <w:tcW w:type="dxa" w:w="2160"/>
+          </w:tcPr>
+          <w:p>
+            <w:r/>
+            <w:r>
+              <w:t>−7 %</w:t>
+            </w:r>
+          </w:p>
+        </w:tc>
+        <w:tc>
+          <w:tcPr>
+            <w:tcW w:type="dxa" w:w="2160"/>
+          </w:tcPr>
+          <w:p>
+            <w:r/>
+            <w:r>
+              <w:t>0.31</w:t>
+            </w:r>
+          </w:p>
+        </w:tc>
+      </w:tr>
+      <w:tr>
+        <w:tc>
+          <w:tcPr>
+            <w:tcW w:type="dxa" w:w="2160"/>
+          </w:tcPr>
+          <w:p>
+            <w:r/>
+            <w:r>
+              <w:rPr>
+                <w:b/>
+              </w:rPr>
+              <w:t>Gaussian process</w:t>
+            </w:r>
+          </w:p>
+        </w:tc>
+        <w:tc>
+          <w:tcPr>
+            <w:tcW w:type="dxa" w:w="2160"/>
+          </w:tcPr>
+          <w:p>
+            <w:r/>
+            <w:r>
+              <w:t>+36 %</w:t>
+            </w:r>
+          </w:p>
+        </w:tc>
+        <w:tc>
+          <w:tcPr>
+            <w:tcW w:type="dxa" w:w="2160"/>
+          </w:tcPr>
+          <w:p>
+            <w:r/>
+            <w:r>
+              <w:rPr>
+                <w:b/>
+              </w:rPr>
+              <w:t>+7 %</w:t>
+            </w:r>
+          </w:p>
+        </w:tc>
+        <w:tc>
+          <w:tcPr>
+            <w:tcW w:type="dxa" w:w="2160"/>
+          </w:tcPr>
+          <w:p>
+            <w:r/>
+            <w:r>
+              <w:rPr>
+                <w:b/>
+              </w:rPr>
+              <w:t>0.62</w:t>
+            </w:r>
+          </w:p>
+        </w:tc>
+      </w:tr>
+      <w:tr>
+        <w:tc>
+          <w:tcPr>
+            <w:tcW w:type="dxa" w:w="2160"/>
+          </w:tcPr>
+          <w:p>
+            <w:r/>
+            <w:r>
+              <w:t>Mixture-of-experts</w:t>
+            </w:r>
+          </w:p>
+        </w:tc>
+        <w:tc>
+          <w:tcPr>
+            <w:tcW w:type="dxa" w:w="2160"/>
+          </w:tcPr>
+          <w:p>
+            <w:r/>
+            <w:r>
+              <w:t>+19 %</w:t>
+            </w:r>
+          </w:p>
+        </w:tc>
+        <w:tc>
+          <w:tcPr>
+            <w:tcW w:type="dxa" w:w="2160"/>
+          </w:tcPr>
+          <w:p>
+            <w:r/>
+            <w:r>
+              <w:t>−82 %</w:t>
+            </w:r>
+          </w:p>
+        </w:tc>
+        <w:tc>
+          <w:tcPr>
+            <w:tcW w:type="dxa" w:w="2160"/>
+          </w:tcPr>
+          <w:p>
+            <w:r/>
+            <w:r>
+              <w:t>0.63</w:t>
+            </w:r>
+          </w:p>
+        </w:tc>
+      </w:tr>
+      <w:tr>
+        <w:tc>
+          <w:tcPr>
+            <w:tcW w:type="dxa" w:w="2160"/>
+          </w:tcPr>
+          <w:p>
+            <w:r/>
+            <w:r>
+              <w:t>XGBoost (this work)</w:t>
+            </w:r>
+          </w:p>
+        </w:tc>
+        <w:tc>
+          <w:tcPr>
+            <w:tcW w:type="dxa" w:w="2160"/>
+          </w:tcPr>
+          <w:p>
+            <w:r/>
+            <w:r>
+              <w:t>+8 %</w:t>
+            </w:r>
+          </w:p>
+        </w:tc>
+        <w:tc>
+          <w:tcPr>
+            <w:tcW w:type="dxa" w:w="2160"/>
+          </w:tcPr>
+          <w:p>
+            <w:r/>
+            <w:r>
+              <w:t>−17 %</w:t>
+            </w:r>
+          </w:p>
+        </w:tc>
+        <w:tc>
+          <w:tcPr>
+            <w:tcW w:type="dxa" w:w="2160"/>
+          </w:tcPr>
+          <w:p>
+            <w:r/>
+            <w:r>
+              <w:t>0.49</w:t>
+            </w:r>
+          </w:p>
+        </w:tc>
+      </w:tr>
+      <w:tr>
+        <w:tc>
+          <w:tcPr>
+            <w:tcW w:type="dxa" w:w="2160"/>
+          </w:tcPr>
+          <w:p>
+            <w:r/>
+            <w:r>
+              <w:t>Physics-prior hybrid</w:t>
+            </w:r>
+          </w:p>
+        </w:tc>
+        <w:tc>
+          <w:tcPr>
+            <w:tcW w:type="dxa" w:w="2160"/>
+          </w:tcPr>
+          <w:p>
+            <w:r/>
+            <w:r>
+              <w:t>+9 %</w:t>
+            </w:r>
+          </w:p>
+        </w:tc>
+        <w:tc>
+          <w:tcPr>
+            <w:tcW w:type="dxa" w:w="2160"/>
+          </w:tcPr>
+          <w:p>
+            <w:r/>
+            <w:r>
+              <w:t>−19 %</w:t>
+            </w:r>
+          </w:p>
+        </w:tc>
+        <w:tc>
+          <w:tcPr>
+            <w:tcW w:type="dxa" w:w="2160"/>
+          </w:tcPr>
+          <w:p>
+            <w:r/>
+            <w:r>
+              <w:t>0.58</w:t>
+            </w:r>
+          </w:p>
+        </w:tc>
+      </w:tr>
+    </w:tbl>
+    <w:p/>
+    <w:p>
+      <w:pPr>
+        <w:pStyle w:val="Heading2"/>
+      </w:pPr>
+      <w:r>
+        <w:t>3.5 Anaikadu case study: microclimate and crop ranking</w:t>
       </w:r>
     </w:p>
     <w:p>
@@ -4126,7 +4626,7 @@
         <w:pStyle w:val="Heading2"/>
       </w:pPr>
       <w:r>
-        <w:t>3.5 Economics, finance and risk</w:t>
+        <w:t>3.6 Economics, finance and risk</w:t>
       </w:r>
     </w:p>
     <w:p>
@@ -4149,7 +4649,7 @@
         <w:t>lowest probability of loss</w:t>
       </w:r>
       <w:r>
-        <w:t xml:space="preserve"> among the intercrops (P(loss) ≈ 12 %); it is the strongest annual-cash system because it bears early, stays viable across the temperature band, and has lower loss probability than nutmeg. Coconut + nutmeg is marginal at the central estimate (NPV ≈ ₹127k, IRR ≈ 13 %, P(loss) ≈ 41 %) — its wide loss probability reflecting exactly the thermal-edge sensitivity of §3.4. Coconut alone is positive but modest (≈ ₹129k, P(loss) ≈ 3 %); banana under mature coconut is uneconomic. Timber overstoreys (mahogany, teak) show high </w:t>
+        <w:t xml:space="preserve"> among the intercrops (P(loss) ≈ 12 %); it is the strongest annual-cash system because it bears early, stays viable across the temperature band, and has lower loss probability than nutmeg. Coconut + nutmeg is marginal at the central estimate (NPV ≈ ₹127k, IRR ≈ 13 %, P(loss) ≈ 41 %) — its wide loss probability reflecting exactly the thermal-edge sensitivity of §3.5. Coconut alone is positive but modest (≈ ₹129k, P(loss) ≈ 3 %); banana under mature coconut is uneconomic. Timber overstoreys (mahogany, teak) show high </w:t>
       </w:r>
       <w:r>
         <w:rPr>
@@ -4767,7 +5267,16 @@
         <w:t>within</w:t>
       </w:r>
       <w:r>
-        <w:t xml:space="preserve"> a climatic regime, consistent with ForestTemp's European success, but our leave-one-climate-out test shows it does not transfer to a sufficiently different macroclimate — and that a popular "add a physics prior" fix does not help when the prior itself is fit out-of-regime. For a decision tool this is the difference between honesty and harm: a system that confidently extrapolated the learned offset into warm-night Tamil Nadu would mislead exactly the user it is meant to serve. Building the OOD flag and reporting the coverage collapse converts an unfalsifiable claim into a falsifiable, improvable one — and the few-shot recalibration result shows the fix is small and local.</w:t>
+        <w:t xml:space="preserve"> a climatic regime, consistent with ForestTemp's European success, but our leave-one-climate-out test shows it does not transfer to a sufficiently different macroclimate — and the six-model benchmark (§3.4) shows this is a property of the </w:t>
+      </w:r>
+      <w:r>
+        <w:rPr>
+          <w:i/>
+        </w:rPr>
+        <w:t>problem</w:t>
+      </w:r>
+      <w:r>
+        <w:t>, not the estimator: linear and mixture-of-experts models extrapolate catastrophically, tree models are bounded but lose their skill, and even the most graceful family (the distance-aware Gaussian process) only holds calibration, not accuracy, out-of-regime. The "add a physics prior" fix likewise does not help when the prior itself is fit out-of-regime. For a decision tool this is the difference between honesty and harm: a system that confidently extrapolated the learned offset into warm-night Tamil Nadu would mislead exactly the user it is meant to serve. Building the OOD flag and reporting the coverage collapse converts an unfalsifiable claim into a falsifiable, improvable one — and the few-shot recalibration result shows the fix is small and local.</w:t>
       </w:r>
     </w:p>
     <w:p>
@@ -4890,7 +5399,7 @@
     </w:p>
     <w:p>
       <w:r>
-        <w:t>This work presents a confidence-labelled agroforestry design-to-profit framework linking controllable canopy and management decisions to microclimate offsets, disease risk, crop viability and risk-adjusted finance. Across 596 borrowed-label sites the learned offset model is skilful within observed regimes (leave-one-site-out dT_mean MAE ≈ 0.41 °C, +49 % skill), but strict leave-one-climate-out validation shows that cross-macroclimate transfer remains unresolved and that prediction intervals lose calibration out of regime. Rather than hiding this, the framework exposes it through out-of-distribution flags and propagated uncertainty, while few-shot conformal recalibration quantifies how a small number of local observations (≈ 5–25) restores interval honesty. Applied to Anaikadu, the physics-supported and sensitivity-robust result favours coconut with black pepper as the current actionable system, while nutmeg remains conditional on local sensing confirming a cooler under-canopy microclimate. The next decisive step is in-regime field data, which would turn this honest decision framework into a locally calibrated digital twin.</w:t>
+        <w:t>This work presents a confidence-labelled agroforestry design-to-profit framework linking controllable canopy and management decisions to microclimate offsets, disease risk, crop viability and risk-adjusted finance. Across 596 borrowed-label sites the learned offset model is skilful within observed regimes (leave-one-site-out dT_mean MAE ≈ 0.41 °C, +49 % skill), but strict leave-one-climate-out validation shows that cross-macroclimate transfer remains unresolved and that prediction intervals lose calibration out of regime. A six-family model benchmark confirms this is a property of the data regime rather than the estimator — no family transfers across the warm-night gap, and only a distance-aware Gaussian process keeps its intervals honest out-of-climate. Rather than hiding this, the framework exposes it through out-of-distribution flags and propagated uncertainty, while few-shot conformal recalibration quantifies how a small number of local observations (≈ 5–25) restores interval honesty. Applied to Anaikadu, the physics-supported and sensitivity-robust result favours coconut with black pepper as the current actionable system, while nutmeg remains conditional on local sensing confirming a cooler under-canopy microclimate. The next decisive step is in-regime field data, which would turn this honest decision framework into a locally calibrated digital twin.</w:t>
       </w:r>
     </w:p>
     <w:p>
@@ -4903,7 +5412,27 @@
     </w:p>
     <w:p>
       <w:r>
-        <w:t>All code, build scripts and the architectural decision records are openly available in the project repository (a tagged release will accompany submission). The pipeline reproduces every figure and table from openly-sourced inputs: microclimate labels from Zenodo (refs 11–14); remote-sensing features via Google Earth Engine; economics from NHB DPRs, TNAU, a Salem-District study, and data.gov.in Agmarknet. Raw third-party data are not redistributed; the build scripts that fetch and assemble them are committed. An interactive version of all results is provided as a self-contained HTML report.</w:t>
+        <w:t xml:space="preserve">All code, build scripts and the architectural decision records are openly available in the project repository (a tagged release will accompany submission). The pipeline reproduces every figure and table from openly-sourced inputs: microclimate labels from Zenodo (refs 11–14); remote-sensing features via Google Earth Engine; economics from NHB DPRs, TNAU, a Salem-District study, and data.gov.in Agmarknet. The model-family benchmark (§3.4) is reproduced by </w:t>
+      </w:r>
+      <w:r>
+        <w:rPr>
+          <w:rFonts w:ascii="Consolas" w:hAnsi="Consolas"/>
+          <w:sz w:val="19"/>
+        </w:rPr>
+        <w:t>scripts/benchmark_models.py</w:t>
+      </w:r>
+      <w:r>
+        <w:t xml:space="preserve"> → </w:t>
+      </w:r>
+      <w:r>
+        <w:rPr>
+          <w:rFonts w:ascii="Consolas" w:hAnsi="Consolas"/>
+          <w:sz w:val="19"/>
+        </w:rPr>
+        <w:t>reports/benchmark_metrics.json</w:t>
+      </w:r>
+      <w:r>
+        <w:t>. Raw third-party data are not redistributed; the build scripts that fetch and assemble them are committed. An interactive version of all results is provided as a self-contained HTML report.</w:t>
       </w:r>
     </w:p>
     <w:p>
@@ -6101,11 +6630,81 @@
       </w:r>
     </w:p>
     <w:p>
+      <w:pPr>
+        <w:jc w:val="center"/>
+      </w:pPr>
+      <w:r>
+        <w:drawing>
+          <wp:inline xmlns:a="http://schemas.openxmlformats.org/drawingml/2006/main" xmlns:pic="http://schemas.openxmlformats.org/drawingml/2006/picture">
+            <wp:extent cx="5486400" cy="1973091"/>
+            <wp:docPr id="12" name="Picture 12"/>
+            <wp:cNvGraphicFramePr>
+              <a:graphicFrameLocks noChangeAspect="1"/>
+            </wp:cNvGraphicFramePr>
+            <a:graphic>
+              <a:graphicData uri="http://schemas.openxmlformats.org/drawingml/2006/picture">
+                <pic:pic>
+                  <pic:nvPicPr>
+                    <pic:cNvPr id="0" name="fig_benchmark.png"/>
+                    <pic:cNvPicPr/>
+                  </pic:nvPicPr>
+                  <pic:blipFill>
+                    <a:blip r:embed="rId20"/>
+                    <a:stretch>
+                      <a:fillRect/>
+                    </a:stretch>
+                  </pic:blipFill>
+                  <pic:spPr>
+                    <a:xfrm>
+                      <a:off x="0" y="0"/>
+                      <a:ext cx="5486400" cy="1973091"/>
+                    </a:xfrm>
+                    <a:prstGeom prst="rect"/>
+                  </pic:spPr>
+                </pic:pic>
+              </a:graphicData>
+            </a:graphic>
+          </wp:inline>
+        </w:drawing>
+      </w:r>
+    </w:p>
+    <w:p>
+      <w:pPr>
+        <w:spacing w:after="200"/>
+      </w:pPr>
+      <w:r>
+        <w:rPr>
+          <w:b/>
+          <w:sz w:val="19"/>
+        </w:rPr>
+        <w:t>Figure 12.</w:t>
+      </w:r>
+      <w:r>
+        <w:rPr>
+          <w:sz w:val="19"/>
+        </w:rPr>
+        <w:t xml:space="preserve"> Model-family benchmark. All families are skilful in-distribution (left, green); under leave-one-climate-out only the Gaussian process keeps positive skill (left), and distance-aware uncertainty (Gaussian process) stays best-calibrated out-of-climate (right). (</w:t>
+      </w:r>
+      <w:r>
+        <w:rPr>
+          <w:rFonts w:ascii="Consolas" w:hAnsi="Consolas"/>
+          <w:sz w:val="19"/>
+        </w:rPr>
+        <w:t>figures/fig_benchmark.png</w:t>
+      </w:r>
+      <w:r>
+        <w:rPr>
+          <w:sz w:val="19"/>
+        </w:rPr>
+        <w:t>)</w:t>
+      </w:r>
+    </w:p>
+    <w:p>
       <w:r>
         <w:rPr>
           <w:i/>
         </w:rPr>
-        <w:t>Tables 1–7 appear inline in their respective sections.</w:t>
+        <w:t>Tables 1–8 appear inline in their respective sections.</w:t>
       </w:r>
     </w:p>
     <w:sectPr>

</xml_diff>

<commit_message>
Fix figure/table numbering to appearance order; trim Highlights to 5
- Tables renumbered to first-appearance order: benchmark 8->6, sensitivity 6->7,
  finance 7->8; in-text refs updated.
- Figures renumbered to first-appearance order: schematic->1, site->2, ...,
  benchmark->7, microclimate->8, envelope->9, economics->10, montecarlo->11,
  cashflow->12; all in-text refs + caption list updated; docx re-embeds in order.
- Highlights trimmed 6->5 bullets, each shorter (Elsevier limit).
- ('Materials and methods' heading kept: standard STEM heading, not 'Methodology'.)
</commit_message>
<xml_diff>
--- a/docs/manuscript/submission/manuscript.docx
+++ b/docs/manuscript/submission/manuscript.docx
@@ -44,16 +44,7 @@
         <w:pStyle w:val="ListBullet"/>
       </w:pPr>
       <w:r>
-        <w:t xml:space="preserve">A six-layer model chains agroforestry </w:t>
-      </w:r>
-      <w:r>
-        <w:rPr>
-          <w:b/>
-        </w:rPr>
-        <w:t>design → microclimate → disease → crop viability → profit</w:t>
-      </w:r>
-      <w:r>
-        <w:t xml:space="preserve"> under propagated uncertainty.</w:t>
+        <w:t>A six-layer model links agroforestry design to microclimate, disease, viability and profit.</w:t>
       </w:r>
     </w:p>
     <w:p>
@@ -61,7 +52,7 @@
         <w:pStyle w:val="ListBullet"/>
       </w:pPr>
       <w:r>
-        <w:t>Canopy temperature/VPD offsets are learned (gradient-boosted, quantile) with conformal intervals and an out-of-distribution flag; light and wind are mechanistic.</w:t>
+        <w:t>Canopy temperature/VPD offsets are gradient-boosted with conformal intervals and an OOD flag.</w:t>
       </w:r>
     </w:p>
     <w:p>
@@ -69,25 +60,7 @@
         <w:pStyle w:val="ListBullet"/>
       </w:pPr>
       <w:r>
-        <w:t xml:space="preserve">Offsets transfer </w:t>
-      </w:r>
-      <w:r>
-        <w:rPr>
-          <w:b/>
-        </w:rPr>
-        <w:t>within</w:t>
-      </w:r>
-      <w:r>
-        <w:t xml:space="preserve"> climate (leave-one-site-out skill +49 %) but </w:t>
-      </w:r>
-      <w:r>
-        <w:rPr>
-          <w:b/>
-        </w:rPr>
-        <w:t>fail across</w:t>
-      </w:r>
-      <w:r>
-        <w:t xml:space="preserve"> macroclimates (leave-one-climate-out skill negative; intervals lose calibration).</w:t>
+        <w:t>Offsets transfer within climate (skill +49 %) but fail across macroclimates (leave-one-climate-out).</w:t>
       </w:r>
     </w:p>
     <w:p>
@@ -95,7 +68,7 @@
         <w:pStyle w:val="ListBullet"/>
       </w:pPr>
       <w:r>
-        <w:t>~5–25 local calibration points restore out-of-climate interval coverage from 0.08 to ~0.80 — quantifying the value of on-plot sensing.</w:t>
+        <w:t>~5–25 local points restore out-of-climate interval coverage, quantifying on-plot sensing value.</w:t>
       </w:r>
     </w:p>
     <w:p>
@@ -103,15 +76,7 @@
         <w:pStyle w:val="ListBullet"/>
       </w:pPr>
       <w:r>
-        <w:t>A six-family benchmark shows transfer failure is a data-regime property, not an estimator flaw; only a distance-aware Gaussian process stays calibrated out-of-climate.</w:t>
-      </w:r>
-    </w:p>
-    <w:p>
-      <w:pPr>
-        <w:pStyle w:val="ListBullet"/>
-      </w:pPr>
-      <w:r>
-        <w:t>For a real Tamil Nadu farm, coconut + black pepper is the robust, profitable pick; the model flags rather than over-claims its extrapolations.</w:t>
+        <w:t>For a Tamil Nadu farm, coconut + black pepper is the robust, profitable, honestly-flagged pick.</w:t>
       </w:r>
     </w:p>
     <w:p>
@@ -1082,7 +1047,7 @@
     </w:p>
     <w:p>
       <w:r>
-        <w:t>end-to-end, with an explicit confidence level on every layer and uncertainty propagated to the decision (Fig. 2).</w:t>
+        <w:t>end-to-end, with an explicit confidence level on every layer and uncertainty propagated to the decision (Fig. 1).</w:t>
       </w:r>
     </w:p>
     <w:p>
@@ -1095,7 +1060,7 @@
     </w:p>
     <w:p>
       <w:r>
-        <w:t>The system is a chain of six layers (Fig. 2), each matched to the simplest method its physics and data support. Decomposition rather than one monolithic model is the central design decision: it lets mechanistic physics carry the variables it governs exactly, confines machine learning to the variables that genuinely need it, keeps every step interpretable, and lets uncertainty be attached and propagated layer by layer (Table 2).</w:t>
+        <w:t>The system is a chain of six layers (Fig. 1), each matched to the simplest method its physics and data support. Decomposition rather than one monolithic model is the central design decision: it lets mechanistic physics carry the variables it governs exactly, confines machine learning to the variables that genuinely need it, keeps every step interpretable, and lets uncertainty be attached and propagated layer by layer (Table 2).</w:t>
       </w:r>
     </w:p>
     <w:p>
@@ -1117,7 +1082,7 @@
         <w:t>Anaikadu (10.4019° N, 79.3545° E), Pattukkottai taluk, Thanjavur District, Tamil Nadu, India</w:t>
       </w:r>
       <w:r>
-        <w:t xml:space="preserve"> — a hot semi-arid pocket of the Cauvery delta (Fig. 1). ERA5 (2019) at the plot gives a mean air temperature of 29.3 °C, mean daily maximum 34.3 °C, and — importantly — a mean daily </w:t>
+        <w:t xml:space="preserve"> — a hot semi-arid pocket of the Cauvery delta (Fig. 2). ERA5 (2019) at the plot gives a mean air temperature of 29.3 °C, mean daily maximum 34.3 °C, and — importantly — a mean daily </w:t>
       </w:r>
       <w:r>
         <w:rPr>
@@ -3859,7 +3824,7 @@
     </w:p>
     <w:p>
       <w:r>
-        <w:t xml:space="preserve">To test whether the transfer failure is specific to gradient boosting or a property of the problem, we benchmarked six model families on the identical offset task and folds (Methods §2.10; Table 8; Fig. 12): a Ridge linear baseline, Random Forest, a Gaussian process (distance-aware predictive variance), a non-neural mixture-of-experts (one regime expert + a distance gate), the paper's XGBoost-quantile model, and the physics-prior hybrid. Two results stand out. First, </w:t>
+        <w:t xml:space="preserve">To test whether the transfer failure is specific to gradient boosting or a property of the problem, we benchmarked six model families on the identical offset task and folds (Methods §2.10; Table 6; Fig. 7): a Ridge linear baseline, Random Forest, a Gaussian process (distance-aware predictive variance), a non-neural mixture-of-experts (one regime expert + a distance gate), the paper's XGBoost-quantile model, and the physics-prior hybrid. Two results stand out. First, </w:t>
       </w:r>
       <w:r>
         <w:rPr>
@@ -3903,7 +3868,7 @@
         <w:rPr>
           <w:b/>
         </w:rPr>
-        <w:t>Table 8.</w:t>
+        <w:t>Table 6.</w:t>
       </w:r>
       <w:r>
         <w:t xml:space="preserve"> Model-family comparison: skill (vs train-mean baseline, Eq. 20) and out-of-climate interval coverage, averaged over the three offset targets. </w:t>
@@ -4311,7 +4276,7 @@
     </w:p>
     <w:p>
       <w:r>
-        <w:t xml:space="preserve">Under a wide-spaced coconut overstorey the physics layer predicts ≈ 39 % shade and a modest in-field wind reduction (HIGH confidence; Fig. 7); the temperature/VPD offset is reported with its LOW-confidence flag. Scoring candidate intercrops against the ECOCROP/PROSEA-sourced envelopes (Fig. 8), all candidates are temperature-limited at this hot site. Sweeping the </w:t>
+        <w:t xml:space="preserve">Under a wide-spaced coconut overstorey the physics layer predicts ≈ 39 % shade and a modest in-field wind reduction (HIGH confidence; Fig. 8); the temperature/VPD offset is reported with its LOW-confidence flag. Scoring candidate intercrops against the ECOCROP/PROSEA-sourced envelopes (Fig. 9), all candidates are temperature-limited at this hot site. Sweeping the </w:t>
       </w:r>
       <w:r>
         <w:rPr>
@@ -4320,7 +4285,7 @@
         <w:t>uncertain</w:t>
       </w:r>
       <w:r>
-        <w:t xml:space="preserve"> temperature offset across its full plausible band (Table 6) is revealing: </w:t>
+        <w:t xml:space="preserve"> temperature offset across its full plausible band (Table 7) is revealing: </w:t>
       </w:r>
       <w:r>
         <w:rPr>
@@ -4346,7 +4311,7 @@
         <w:rPr>
           <w:b/>
         </w:rPr>
-        <w:t>Table 6.</w:t>
+        <w:t>Table 7.</w:t>
       </w:r>
       <w:r>
         <w:t xml:space="preserve"> Top-3 intercrop by viability as the (LOW-confidence) temperature offset is swept; under-canopy T_max in parentheses.</w:t>
@@ -4631,7 +4596,7 @@
     </w:p>
     <w:p>
       <w:r>
-        <w:t xml:space="preserve">Converting viability to profit (Eqs. 11–17) turns "can the crop grow?" into "is the system worth planting under uncertainty?" (Table 7; Figs. 9–11). Over 25 years at an 8 % real hurdle, coconut + </w:t>
+        <w:t xml:space="preserve">Converting viability to profit (Eqs. 11–17) turns "can the crop grow?" into "is the system worth planting under uncertainty?" (Table 8; Figs. 10–12). Over 25 years at an 8 % real hurdle, coconut + </w:t>
       </w:r>
       <w:r>
         <w:rPr>
@@ -4666,7 +4631,7 @@
         <w:rPr>
           <w:b/>
         </w:rPr>
-        <w:t>Table 7.</w:t>
+        <w:t>Table 8.</w:t>
       </w:r>
       <w:r>
         <w:t xml:space="preserve"> Anaikadu system finance and risk (25 yr, 8 % real).</w:t>
@@ -5422,7 +5387,17 @@
         <w:t>scripts/benchmark_models.py</w:t>
       </w:r>
       <w:r>
-        <w:t xml:space="preserve"> → </w:t>
+        <w:t xml:space="preserve"> (model classes in </w:t>
+      </w:r>
+      <w:r>
+        <w:rPr>
+          <w:rFonts w:ascii="Consolas" w:hAnsi="Consolas"/>
+          <w:sz w:val="19"/>
+        </w:rPr>
+        <w:t>src/agroforestry/models_benchmark.py</w:t>
+      </w:r>
+      <w:r>
+        <w:t xml:space="preserve">) → </w:t>
       </w:r>
       <w:r>
         <w:rPr>
@@ -5866,8 +5841,78 @@
       <w:r>
         <w:drawing>
           <wp:inline xmlns:a="http://schemas.openxmlformats.org/drawingml/2006/main" xmlns:pic="http://schemas.openxmlformats.org/drawingml/2006/picture">
+            <wp:extent cx="5486400" cy="2025361"/>
+            <wp:docPr id="1" name="Picture 1"/>
+            <wp:cNvGraphicFramePr>
+              <a:graphicFrameLocks noChangeAspect="1"/>
+            </wp:cNvGraphicFramePr>
+            <a:graphic>
+              <a:graphicData uri="http://schemas.openxmlformats.org/drawingml/2006/picture">
+                <pic:pic>
+                  <pic:nvPicPr>
+                    <pic:cNvPr id="0" name="fig0_pipeline.png"/>
+                    <pic:cNvPicPr/>
+                  </pic:nvPicPr>
+                  <pic:blipFill>
+                    <a:blip r:embed="rId9"/>
+                    <a:stretch>
+                      <a:fillRect/>
+                    </a:stretch>
+                  </pic:blipFill>
+                  <pic:spPr>
+                    <a:xfrm>
+                      <a:off x="0" y="0"/>
+                      <a:ext cx="5486400" cy="2025361"/>
+                    </a:xfrm>
+                    <a:prstGeom prst="rect"/>
+                  </pic:spPr>
+                </pic:pic>
+              </a:graphicData>
+            </a:graphic>
+          </wp:inline>
+        </w:drawing>
+      </w:r>
+    </w:p>
+    <w:p>
+      <w:pPr>
+        <w:spacing w:after="200"/>
+      </w:pPr>
+      <w:r>
+        <w:rPr>
+          <w:b/>
+          <w:sz w:val="19"/>
+        </w:rPr>
+        <w:t>Figure 1.</w:t>
+      </w:r>
+      <w:r>
+        <w:rPr>
+          <w:sz w:val="19"/>
+        </w:rPr>
+        <w:t xml:space="preserve"> Six-layer methods schematic: controllable design → microclimate → disease → viability → economics → finance → Monte-Carlo profit, with per-layer confidence and the inverse-design loop. (</w:t>
+      </w:r>
+      <w:r>
+        <w:rPr>
+          <w:rFonts w:ascii="Consolas" w:hAnsi="Consolas"/>
+          <w:sz w:val="19"/>
+        </w:rPr>
+        <w:t>figures/fig0_pipeline.png</w:t>
+      </w:r>
+      <w:r>
+        <w:rPr>
+          <w:sz w:val="19"/>
+        </w:rPr>
+        <w:t>)</w:t>
+      </w:r>
+    </w:p>
+    <w:p>
+      <w:pPr>
+        <w:jc w:val="center"/>
+      </w:pPr>
+      <w:r>
+        <w:drawing>
+          <wp:inline xmlns:a="http://schemas.openxmlformats.org/drawingml/2006/main" xmlns:pic="http://schemas.openxmlformats.org/drawingml/2006/picture">
             <wp:extent cx="5486400" cy="1963024"/>
-            <wp:docPr id="1" name="Picture 1"/>
+            <wp:docPr id="2" name="Picture 2"/>
             <wp:cNvGraphicFramePr>
               <a:graphicFrameLocks noChangeAspect="1"/>
             </wp:cNvGraphicFramePr>
@@ -5879,7 +5924,7 @@
                     <pic:cNvPicPr/>
                   </pic:nvPicPr>
                   <pic:blipFill>
-                    <a:blip r:embed="rId9"/>
+                    <a:blip r:embed="rId10"/>
                     <a:stretch>
                       <a:fillRect/>
                     </a:stretch>
@@ -5907,7 +5952,7 @@
           <w:b/>
           <w:sz w:val="19"/>
         </w:rPr>
-        <w:t>Figure 1.</w:t>
+        <w:t>Figure 2.</w:t>
       </w:r>
       <w:r>
         <w:rPr>
@@ -5921,76 +5966,6 @@
           <w:sz w:val="19"/>
         </w:rPr>
         <w:t>figures/fig_sitemap.png</w:t>
-      </w:r>
-      <w:r>
-        <w:rPr>
-          <w:sz w:val="19"/>
-        </w:rPr>
-        <w:t>)</w:t>
-      </w:r>
-    </w:p>
-    <w:p>
-      <w:pPr>
-        <w:jc w:val="center"/>
-      </w:pPr>
-      <w:r>
-        <w:drawing>
-          <wp:inline xmlns:a="http://schemas.openxmlformats.org/drawingml/2006/main" xmlns:pic="http://schemas.openxmlformats.org/drawingml/2006/picture">
-            <wp:extent cx="5486400" cy="2025361"/>
-            <wp:docPr id="2" name="Picture 2"/>
-            <wp:cNvGraphicFramePr>
-              <a:graphicFrameLocks noChangeAspect="1"/>
-            </wp:cNvGraphicFramePr>
-            <a:graphic>
-              <a:graphicData uri="http://schemas.openxmlformats.org/drawingml/2006/picture">
-                <pic:pic>
-                  <pic:nvPicPr>
-                    <pic:cNvPr id="0" name="fig0_pipeline.png"/>
-                    <pic:cNvPicPr/>
-                  </pic:nvPicPr>
-                  <pic:blipFill>
-                    <a:blip r:embed="rId10"/>
-                    <a:stretch>
-                      <a:fillRect/>
-                    </a:stretch>
-                  </pic:blipFill>
-                  <pic:spPr>
-                    <a:xfrm>
-                      <a:off x="0" y="0"/>
-                      <a:ext cx="5486400" cy="2025361"/>
-                    </a:xfrm>
-                    <a:prstGeom prst="rect"/>
-                  </pic:spPr>
-                </pic:pic>
-              </a:graphicData>
-            </a:graphic>
-          </wp:inline>
-        </w:drawing>
-      </w:r>
-    </w:p>
-    <w:p>
-      <w:pPr>
-        <w:spacing w:after="200"/>
-      </w:pPr>
-      <w:r>
-        <w:rPr>
-          <w:b/>
-          <w:sz w:val="19"/>
-        </w:rPr>
-        <w:t>Figure 2.</w:t>
-      </w:r>
-      <w:r>
-        <w:rPr>
-          <w:sz w:val="19"/>
-        </w:rPr>
-        <w:t xml:space="preserve"> Six-layer methods schematic: controllable design → microclimate → disease → viability → economics → finance → Monte-Carlo profit, with per-layer confidence and the inverse-design loop. (</w:t>
-      </w:r>
-      <w:r>
-        <w:rPr>
-          <w:rFonts w:ascii="Consolas" w:hAnsi="Consolas"/>
-          <w:sz w:val="19"/>
-        </w:rPr>
-        <w:t>figures/fig0_pipeline.png</w:t>
       </w:r>
       <w:r>
         <w:rPr>
@@ -6286,8 +6261,78 @@
       <w:r>
         <w:drawing>
           <wp:inline xmlns:a="http://schemas.openxmlformats.org/drawingml/2006/main" xmlns:pic="http://schemas.openxmlformats.org/drawingml/2006/picture">
+            <wp:extent cx="5486400" cy="1973091"/>
+            <wp:docPr id="7" name="Picture 7"/>
+            <wp:cNvGraphicFramePr>
+              <a:graphicFrameLocks noChangeAspect="1"/>
+            </wp:cNvGraphicFramePr>
+            <a:graphic>
+              <a:graphicData uri="http://schemas.openxmlformats.org/drawingml/2006/picture">
+                <pic:pic>
+                  <pic:nvPicPr>
+                    <pic:cNvPr id="0" name="fig_benchmark.png"/>
+                    <pic:cNvPicPr/>
+                  </pic:nvPicPr>
+                  <pic:blipFill>
+                    <a:blip r:embed="rId15"/>
+                    <a:stretch>
+                      <a:fillRect/>
+                    </a:stretch>
+                  </pic:blipFill>
+                  <pic:spPr>
+                    <a:xfrm>
+                      <a:off x="0" y="0"/>
+                      <a:ext cx="5486400" cy="1973091"/>
+                    </a:xfrm>
+                    <a:prstGeom prst="rect"/>
+                  </pic:spPr>
+                </pic:pic>
+              </a:graphicData>
+            </a:graphic>
+          </wp:inline>
+        </w:drawing>
+      </w:r>
+    </w:p>
+    <w:p>
+      <w:pPr>
+        <w:spacing w:after="200"/>
+      </w:pPr>
+      <w:r>
+        <w:rPr>
+          <w:b/>
+          <w:sz w:val="19"/>
+        </w:rPr>
+        <w:t>Figure 7.</w:t>
+      </w:r>
+      <w:r>
+        <w:rPr>
+          <w:sz w:val="19"/>
+        </w:rPr>
+        <w:t xml:space="preserve"> Model-family benchmark. All families are skilful in-distribution (left, green); under leave-one-climate-out only the Gaussian process keeps positive skill (left), and distance-aware uncertainty (Gaussian process) stays best-calibrated out-of-climate (right). (</w:t>
+      </w:r>
+      <w:r>
+        <w:rPr>
+          <w:rFonts w:ascii="Consolas" w:hAnsi="Consolas"/>
+          <w:sz w:val="19"/>
+        </w:rPr>
+        <w:t>figures/fig_benchmark.png</w:t>
+      </w:r>
+      <w:r>
+        <w:rPr>
+          <w:sz w:val="19"/>
+        </w:rPr>
+        <w:t>)</w:t>
+      </w:r>
+    </w:p>
+    <w:p>
+      <w:pPr>
+        <w:jc w:val="center"/>
+      </w:pPr>
+      <w:r>
+        <w:drawing>
+          <wp:inline xmlns:a="http://schemas.openxmlformats.org/drawingml/2006/main" xmlns:pic="http://schemas.openxmlformats.org/drawingml/2006/picture">
             <wp:extent cx="5486400" cy="2581172"/>
-            <wp:docPr id="7" name="Picture 7"/>
+            <wp:docPr id="8" name="Picture 8"/>
             <wp:cNvGraphicFramePr>
               <a:graphicFrameLocks noChangeAspect="1"/>
             </wp:cNvGraphicFramePr>
@@ -6299,7 +6344,7 @@
                     <pic:cNvPicPr/>
                   </pic:nvPicPr>
                   <pic:blipFill>
-                    <a:blip r:embed="rId15"/>
+                    <a:blip r:embed="rId16"/>
                     <a:stretch>
                       <a:fillRect/>
                     </a:stretch>
@@ -6327,7 +6372,7 @@
           <w:b/>
           <w:sz w:val="19"/>
         </w:rPr>
-        <w:t>Figure 7.</w:t>
+        <w:t>Figure 8.</w:t>
       </w:r>
       <w:r>
         <w:rPr>
@@ -6357,7 +6402,7 @@
         <w:drawing>
           <wp:inline xmlns:a="http://schemas.openxmlformats.org/drawingml/2006/main" xmlns:pic="http://schemas.openxmlformats.org/drawingml/2006/picture">
             <wp:extent cx="5486400" cy="2639257"/>
-            <wp:docPr id="8" name="Picture 8"/>
+            <wp:docPr id="9" name="Picture 9"/>
             <wp:cNvGraphicFramePr>
               <a:graphicFrameLocks noChangeAspect="1"/>
             </wp:cNvGraphicFramePr>
@@ -6369,7 +6414,7 @@
                     <pic:cNvPicPr/>
                   </pic:nvPicPr>
                   <pic:blipFill>
-                    <a:blip r:embed="rId16"/>
+                    <a:blip r:embed="rId17"/>
                     <a:stretch>
                       <a:fillRect/>
                     </a:stretch>
@@ -6397,7 +6442,7 @@
           <w:b/>
           <w:sz w:val="19"/>
         </w:rPr>
-        <w:t>Figure 8.</w:t>
+        <w:t>Figure 9.</w:t>
       </w:r>
       <w:r>
         <w:rPr>
@@ -6427,7 +6472,7 @@
         <w:drawing>
           <wp:inline xmlns:a="http://schemas.openxmlformats.org/drawingml/2006/main" xmlns:pic="http://schemas.openxmlformats.org/drawingml/2006/picture">
             <wp:extent cx="5486400" cy="2415506"/>
-            <wp:docPr id="9" name="Picture 9"/>
+            <wp:docPr id="10" name="Picture 10"/>
             <wp:cNvGraphicFramePr>
               <a:graphicFrameLocks noChangeAspect="1"/>
             </wp:cNvGraphicFramePr>
@@ -6439,7 +6484,7 @@
                     <pic:cNvPicPr/>
                   </pic:nvPicPr>
                   <pic:blipFill>
-                    <a:blip r:embed="rId17"/>
+                    <a:blip r:embed="rId18"/>
                     <a:stretch>
                       <a:fillRect/>
                     </a:stretch>
@@ -6467,7 +6512,7 @@
           <w:b/>
           <w:sz w:val="19"/>
         </w:rPr>
-        <w:t>Figure 9.</w:t>
+        <w:t>Figure 10.</w:t>
       </w:r>
       <w:r>
         <w:rPr>
@@ -6497,7 +6542,7 @@
         <w:drawing>
           <wp:inline xmlns:a="http://schemas.openxmlformats.org/drawingml/2006/main" xmlns:pic="http://schemas.openxmlformats.org/drawingml/2006/picture">
             <wp:extent cx="5486400" cy="2572060"/>
-            <wp:docPr id="10" name="Picture 10"/>
+            <wp:docPr id="11" name="Picture 11"/>
             <wp:cNvGraphicFramePr>
               <a:graphicFrameLocks noChangeAspect="1"/>
             </wp:cNvGraphicFramePr>
@@ -6509,7 +6554,7 @@
                     <pic:cNvPicPr/>
                   </pic:nvPicPr>
                   <pic:blipFill>
-                    <a:blip r:embed="rId18"/>
+                    <a:blip r:embed="rId19"/>
                     <a:stretch>
                       <a:fillRect/>
                     </a:stretch>
@@ -6537,7 +6582,7 @@
           <w:b/>
           <w:sz w:val="19"/>
         </w:rPr>
-        <w:t>Figure 10.</w:t>
+        <w:t>Figure 11.</w:t>
       </w:r>
       <w:r>
         <w:rPr>
@@ -6567,7 +6612,7 @@
         <w:drawing>
           <wp:inline xmlns:a="http://schemas.openxmlformats.org/drawingml/2006/main" xmlns:pic="http://schemas.openxmlformats.org/drawingml/2006/picture">
             <wp:extent cx="5486400" cy="2272973"/>
-            <wp:docPr id="11" name="Picture 11"/>
+            <wp:docPr id="12" name="Picture 12"/>
             <wp:cNvGraphicFramePr>
               <a:graphicFrameLocks noChangeAspect="1"/>
             </wp:cNvGraphicFramePr>
@@ -6579,7 +6624,7 @@
                     <pic:cNvPicPr/>
                   </pic:nvPicPr>
                   <pic:blipFill>
-                    <a:blip r:embed="rId19"/>
+                    <a:blip r:embed="rId20"/>
                     <a:stretch>
                       <a:fillRect/>
                     </a:stretch>
@@ -6607,7 +6652,7 @@
           <w:b/>
           <w:sz w:val="19"/>
         </w:rPr>
-        <w:t>Figure 11.</w:t>
+        <w:t>Figure 12.</w:t>
       </w:r>
       <w:r>
         <w:rPr>
@@ -6621,76 +6666,6 @@
           <w:sz w:val="19"/>
         </w:rPr>
         <w:t>figures/fig6_cashflow.png</w:t>
-      </w:r>
-      <w:r>
-        <w:rPr>
-          <w:sz w:val="19"/>
-        </w:rPr>
-        <w:t>)</w:t>
-      </w:r>
-    </w:p>
-    <w:p>
-      <w:pPr>
-        <w:jc w:val="center"/>
-      </w:pPr>
-      <w:r>
-        <w:drawing>
-          <wp:inline xmlns:a="http://schemas.openxmlformats.org/drawingml/2006/main" xmlns:pic="http://schemas.openxmlformats.org/drawingml/2006/picture">
-            <wp:extent cx="5486400" cy="1973091"/>
-            <wp:docPr id="12" name="Picture 12"/>
-            <wp:cNvGraphicFramePr>
-              <a:graphicFrameLocks noChangeAspect="1"/>
-            </wp:cNvGraphicFramePr>
-            <a:graphic>
-              <a:graphicData uri="http://schemas.openxmlformats.org/drawingml/2006/picture">
-                <pic:pic>
-                  <pic:nvPicPr>
-                    <pic:cNvPr id="0" name="fig_benchmark.png"/>
-                    <pic:cNvPicPr/>
-                  </pic:nvPicPr>
-                  <pic:blipFill>
-                    <a:blip r:embed="rId20"/>
-                    <a:stretch>
-                      <a:fillRect/>
-                    </a:stretch>
-                  </pic:blipFill>
-                  <pic:spPr>
-                    <a:xfrm>
-                      <a:off x="0" y="0"/>
-                      <a:ext cx="5486400" cy="1973091"/>
-                    </a:xfrm>
-                    <a:prstGeom prst="rect"/>
-                  </pic:spPr>
-                </pic:pic>
-              </a:graphicData>
-            </a:graphic>
-          </wp:inline>
-        </w:drawing>
-      </w:r>
-    </w:p>
-    <w:p>
-      <w:pPr>
-        <w:spacing w:after="200"/>
-      </w:pPr>
-      <w:r>
-        <w:rPr>
-          <w:b/>
-          <w:sz w:val="19"/>
-        </w:rPr>
-        <w:t>Figure 12.</w:t>
-      </w:r>
-      <w:r>
-        <w:rPr>
-          <w:sz w:val="19"/>
-        </w:rPr>
-        <w:t xml:space="preserve"> Model-family benchmark. All families are skilful in-distribution (left, green); under leave-one-climate-out only the Gaussian process keeps positive skill (left), and distance-aware uncertainty (Gaussian process) stays best-calibrated out-of-climate (right). (</w:t>
-      </w:r>
-      <w:r>
-        <w:rPr>
-          <w:rFonts w:ascii="Consolas" w:hAnsi="Consolas"/>
-          <w:sz w:val="19"/>
-        </w:rPr>
-        <w:t>figures/fig_benchmark.png</w:t>
       </w:r>
       <w:r>
         <w:rPr>

</xml_diff>

<commit_message>
Trim abstract to 248 words (journal limit safety); regenerate docx
</commit_message>
<xml_diff>
--- a/docs/manuscript/submission/manuscript.docx
+++ b/docs/manuscript/submission/manuscript.docx
@@ -89,7 +89,7 @@
     </w:p>
     <w:p>
       <w:r>
-        <w:t xml:space="preserve">An agroforestry system creates its own microclimate, and that microclimate — not the regional average used by conventional crop-recommendation tools — governs which crops are viable, what diseases establish, and whether a planting pays. We present an end-to-end, confidence-labelled decision pipeline chaining six layers: (1) design → microclimate, combining mechanistic physics (Beer–Lambert light, shelterbelt wind) with machine-learned (gradient-boosted, quantile) temperature and vapour-pressure-deficit </w:t>
+        <w:t xml:space="preserve">An agroforestry system creates its own microclimate, and that microclimate — not the regional average used by conventional crop-recommendation tools — governs which crops are viable, what diseases establish, and whether a planting pays. We present an end-to-end, confidence-labelled pipeline of six layers: design → microclimate (mechanistic Beer–Lambert light and shelterbelt wind, plus gradient-boosted quantile temperature and vapour-pressure-deficit </w:t>
       </w:r>
       <w:r>
         <w:rPr>
@@ -98,7 +98,7 @@
         <w:t>offsets</w:t>
       </w:r>
       <w:r>
-        <w:t xml:space="preserve"> carrying conformalised prediction intervals and an out-of-distribution flag; (2) microclimate → disease risk via a two-axis mechanistic model scaled by variety susceptibility; (3) growth + disease → crop viability by fuzzy limiting-factor aggregation; (4) viability → economics; (5) → 25-year discounted cash-flow (NPV, IRR, payback); and (6) → Monte-Carlo propagation to a profit distribution and probability of loss, wrapped by an inverse-design optimiser. Trained on real sub-canopy loggers from tropical Borneo and Mediterranean Spain plus a Borneo oil-palm regime (596 sites, 2,764 site-months), the learned offset is skilful within climate (full leave-one-site-out dT_mean MAE ≈ 0.41 °C, +49 % skill over a mean-offset baseline; calibrated coverage 0.76–0.82). A stricter leave-one-climate-out test, however, shows cross-macroclimate transfer fails (negative skill on a held-out climate; coverage collapsing to ~0.1–0.5), and a physics-prior hybrid does not rescue it; the model therefore flags the target — semi-arid, warm-night Tamil Nadu under an open coconut canopy — as out-of-distribution. We further show that ~5–25 in-regime calibration points restore interval coverage to near 0.80. Applied to a real farm in Anaikadu, a coconut overstorey with a black pepper intercrop is the temperature-robust, profitable pick (NPV ≈ ₹565k/acre, IRR ≈ 33 %, payback 7 yr, P(loss) ≈ 12 %), whereas nutmeg is viable only if a cooler microclimate is confirmed. The contribution is methodological: a transparent, uncertainty-propagating design→profit chain whose honest quantification of </w:t>
+        <w:t xml:space="preserve"> with conformal intervals and an out-of-distribution flag); microclimate → disease risk (two-axis mechanistic model × variety susceptibility); growth + disease → viability (fuzzy limiting-factor); viability → economics and 25-year discounted cash-flow (NPV, IRR, payback); and Monte-Carlo propagation to a profit distribution, wrapped by an inverse-design optimiser. Trained on real sub-canopy loggers from tropical Borneo and Mediterranean Spain plus a Borneo oil-palm regime (596 sites), the learned offset is skilful within climate (leave-one-site-out dT_mean MAE ≈ 0.41 °C, +49 % over a mean-offset baseline; calibrated coverage). A stricter leave-one-climate-out test shows cross-macroclimate transfer fails (negative skill, intervals losing calibration), and a six-model benchmark confirms this is a property of the data regime, not the estimator; the model therefore flags the target — semi-arid, warm-night Tamil Nadu under coconut — as out-of-distribution rather than over-claiming. About 5–25 in-regime calibration points restore interval coverage. For a real farm in Anaikadu, coconut with black pepper is the temperature-robust, profitable pick (NPV ≈ ₹565k/acre, IRR ≈ 33 %, payback 7 yr, P(loss) ≈ 12 %). The contribution is a transparent, uncertainty-propagating design-to-profit chain whose honest quantification of </w:t>
       </w:r>
       <w:r>
         <w:rPr>

</xml_diff>